<commit_message>
Milestone 2: restore code on this branch and run everything with a single run_ms2.sh
</commit_message>
<xml_diff>
--- a/Milestone 02/report/Milestone_02_Report.docx
+++ b/Milestone 02/report/Milestone_02_Report.docx
@@ -499,7 +499,7 @@
       <w:pPr>
         <w:jc w:val="center"/>
       </w:pPr>
-      <w:hyperlink w:history="1" r:id="rIdml1z2k4ccpx04u_b-r5kp">
+      <w:hyperlink w:history="1" r:id="rIdinhzwkjdlhufe5lcuihpq">
         <w:r>
           <w:rPr>
             <w:rStyle w:val="Hyperlink"/>
@@ -12158,7 +12158,17 @@
         <w:spacing w:after="120" w:line="276"/>
       </w:pPr>
       <w:r>
-        <w:t xml:space="preserve">Every step is one command, and the same commands are available in VS Code under ⌘⇧P → "Tasks: Run Task". Start them in this order, each in its own terminal:</w:t>
+        <w:t xml:space="preserve">The whole system starts with one command, </w:t>
+      </w:r>
+      <w:r>
+        <w:rPr>
+          <w:i/>
+          <w:iCs/>
+        </w:rPr>
+        <w:t xml:space="preserve">scripts/run_ms2.sh</w:t>
+      </w:r>
+      <w:r>
+        <w:t xml:space="preserve">. It opens the simulator, starts the ROS2 bridge in Docker, waits until the two are connected, and then runs the chosen input. Ctrl+C stops everything. The same runs are available in VS Code under ⌘⇧P → "Tasks: Run Task" → "Run Milestone 2".</w:t>
       </w:r>
     </w:p>
     <w:tbl>
@@ -12176,9 +12186,8 @@
         <w:tblLayout w:type="fixed"/>
       </w:tblPr>
       <w:tblGrid>
-        <w:gridCol w:w="800"/>
-        <w:gridCol w:w="4300"/>
-        <w:gridCol w:w="3926"/>
+        <w:gridCol w:w="4200"/>
+        <w:gridCol w:w="4826"/>
       </w:tblGrid>
       <w:tr>
         <w:trPr>
@@ -12186,7 +12195,7 @@
         </w:trPr>
         <w:tc>
           <w:tcPr>
-            <w:tcW w:type="dxa" w:w="800"/>
+            <w:tcW w:type="dxa" w:w="4200"/>
             <w:tcBorders>
               <w:top w:val="single" w:color="B7BCC4" w:sz="4"/>
               <w:left w:val="single" w:color="B7BCC4" w:sz="4"/>
@@ -12213,13 +12222,13 @@
                 <w:sz w:val="19"/>
                 <w:szCs w:val="19"/>
               </w:rPr>
-              <w:t xml:space="preserve">Step</w:t>
-            </w:r>
-          </w:p>
-        </w:tc>
-        <w:tc>
-          <w:tcPr>
-            <w:tcW w:type="dxa" w:w="4300"/>
+              <w:t xml:space="preserve">Command</w:t>
+            </w:r>
+          </w:p>
+        </w:tc>
+        <w:tc>
+          <w:tcPr>
+            <w:tcW w:type="dxa" w:w="4826"/>
             <w:tcBorders>
               <w:top w:val="single" w:color="B7BCC4" w:sz="4"/>
               <w:left w:val="single" w:color="B7BCC4" w:sz="4"/>
@@ -12246,40 +12255,7 @@
                 <w:sz w:val="19"/>
                 <w:szCs w:val="19"/>
               </w:rPr>
-              <w:t xml:space="preserve">Command</w:t>
-            </w:r>
-          </w:p>
-        </w:tc>
-        <w:tc>
-          <w:tcPr>
-            <w:tcW w:type="dxa" w:w="3926"/>
-            <w:tcBorders>
-              <w:top w:val="single" w:color="B7BCC4" w:sz="4"/>
-              <w:left w:val="single" w:color="B7BCC4" w:sz="4"/>
-              <w:bottom w:val="single" w:color="B7BCC4" w:sz="4"/>
-              <w:right w:val="single" w:color="B7BCC4" w:sz="4"/>
-            </w:tcBorders>
-            <w:shd w:fill="DCE6F2" w:color="auto" w:val="clear"/>
-            <w:tcMar>
-              <w:top w:type="dxa" w:w="50"/>
-              <w:left w:type="dxa" w:w="90"/>
-              <w:bottom w:type="dxa" w:w="50"/>
-              <w:right w:type="dxa" w:w="90"/>
-            </w:tcMar>
-            <w:vAlign w:val="center"/>
-          </w:tcPr>
-          <w:p>
-            <w:pPr>
-              <w:jc w:val="center"/>
-            </w:pPr>
-            <w:r>
-              <w:rPr>
-                <w:b/>
-                <w:bCs/>
-                <w:sz w:val="19"/>
-                <w:szCs w:val="19"/>
-              </w:rPr>
-              <w:t xml:space="preserve">What it does</w:t>
+              <w:t xml:space="preserve">Input driving the joints</w:t>
             </w:r>
           </w:p>
         </w:tc>
@@ -12287,39 +12263,7 @@
       <w:tr>
         <w:tc>
           <w:tcPr>
-            <w:tcW w:type="dxa" w:w="800"/>
-            <w:tcBorders>
-              <w:top w:val="single" w:color="B7BCC4" w:sz="4"/>
-              <w:left w:val="single" w:color="B7BCC4" w:sz="4"/>
-              <w:bottom w:val="single" w:color="B7BCC4" w:sz="4"/>
-              <w:right w:val="single" w:color="B7BCC4" w:sz="4"/>
-            </w:tcBorders>
-            <w:tcMar>
-              <w:top w:type="dxa" w:w="50"/>
-              <w:left w:type="dxa" w:w="90"/>
-              <w:bottom w:type="dxa" w:w="50"/>
-              <w:right w:type="dxa" w:w="90"/>
-            </w:tcMar>
-            <w:vAlign w:val="center"/>
-          </w:tcPr>
-          <w:p>
-            <w:pPr>
-              <w:jc w:val="center"/>
-            </w:pPr>
-            <w:r>
-              <w:rPr>
-                <w:b w:val="false"/>
-                <w:bCs w:val="false"/>
-                <w:sz w:val="19"/>
-                <w:szCs w:val="19"/>
-              </w:rPr>
-              <w:t xml:space="preserve">1</w:t>
-            </w:r>
-          </w:p>
-        </w:tc>
-        <w:tc>
-          <w:tcPr>
-            <w:tcW w:type="dxa" w:w="4300"/>
+            <w:tcW w:type="dxa" w:w="4200"/>
             <w:tcBorders>
               <w:top w:val="single" w:color="B7BCC4" w:sz="4"/>
               <w:left w:val="single" w:color="B7BCC4" w:sz="4"/>
@@ -12345,13 +12289,13 @@
                 <w:sz w:val="19"/>
                 <w:szCs w:val="19"/>
               </w:rPr>
-              <w:t xml:space="preserve">scripts/run_m2_simulator.sh</w:t>
-            </w:r>
-          </w:p>
-        </w:tc>
-        <w:tc>
-          <w:tcPr>
-            <w:tcW w:type="dxa" w:w="3926"/>
+              <w:t xml:space="preserve">scripts/run_ms2.sh</w:t>
+            </w:r>
+          </w:p>
+        </w:tc>
+        <w:tc>
+          <w:tcPr>
+            <w:tcW w:type="dxa" w:w="4826"/>
             <w:tcBorders>
               <w:top w:val="single" w:color="B7BCC4" w:sz="4"/>
               <w:left w:val="single" w:color="B7BCC4" w:sz="4"/>
@@ -12377,7 +12321,7 @@
                 <w:sz w:val="19"/>
                 <w:szCs w:val="19"/>
               </w:rPr>
-              <w:t xml:space="preserve">opens MuJoCo with the arm, gripper and work cell, and waits for ROS2</w:t>
+              <w:t xml:space="preserve">pick-and-place step sequence (default)</w:t>
             </w:r>
           </w:p>
         </w:tc>
@@ -12385,39 +12329,7 @@
       <w:tr>
         <w:tc>
           <w:tcPr>
-            <w:tcW w:type="dxa" w:w="800"/>
-            <w:tcBorders>
-              <w:top w:val="single" w:color="B7BCC4" w:sz="4"/>
-              <w:left w:val="single" w:color="B7BCC4" w:sz="4"/>
-              <w:bottom w:val="single" w:color="B7BCC4" w:sz="4"/>
-              <w:right w:val="single" w:color="B7BCC4" w:sz="4"/>
-            </w:tcBorders>
-            <w:tcMar>
-              <w:top w:type="dxa" w:w="50"/>
-              <w:left w:type="dxa" w:w="90"/>
-              <w:bottom w:type="dxa" w:w="50"/>
-              <w:right w:type="dxa" w:w="90"/>
-            </w:tcMar>
-            <w:vAlign w:val="center"/>
-          </w:tcPr>
-          <w:p>
-            <w:pPr>
-              <w:jc w:val="center"/>
-            </w:pPr>
-            <w:r>
-              <w:rPr>
-                <w:b w:val="false"/>
-                <w:bCs w:val="false"/>
-                <w:sz w:val="19"/>
-                <w:szCs w:val="19"/>
-              </w:rPr>
-              <w:t xml:space="preserve">2</w:t>
-            </w:r>
-          </w:p>
-        </w:tc>
-        <w:tc>
-          <w:tcPr>
-            <w:tcW w:type="dxa" w:w="4300"/>
+            <w:tcW w:type="dxa" w:w="4200"/>
             <w:tcBorders>
               <w:top w:val="single" w:color="B7BCC4" w:sz="4"/>
               <w:left w:val="single" w:color="B7BCC4" w:sz="4"/>
@@ -12443,13 +12355,13 @@
                 <w:sz w:val="19"/>
                 <w:szCs w:val="19"/>
               </w:rPr>
-              <w:t xml:space="preserve">scripts/run_m2_bridge.sh</w:t>
-            </w:r>
-          </w:p>
-        </w:tc>
-        <w:tc>
-          <w:tcPr>
-            <w:tcW w:type="dxa" w:w="3926"/>
+              <w:t xml:space="preserve">scripts/run_ms2.sh sine</w:t>
+            </w:r>
+          </w:p>
+        </w:tc>
+        <w:tc>
+          <w:tcPr>
+            <w:tcW w:type="dxa" w:w="4826"/>
             <w:tcBorders>
               <w:top w:val="single" w:color="B7BCC4" w:sz="4"/>
               <w:left w:val="single" w:color="B7BCC4" w:sz="4"/>
@@ -12475,7 +12387,7 @@
                 <w:sz w:val="19"/>
                 <w:szCs w:val="19"/>
               </w:rPr>
-              <w:t xml:space="preserve">starts the ROS2 bridge node in Docker and connects to the simulator</w:t>
+              <w:t xml:space="preserve">sine wave on every joint</w:t>
             </w:r>
           </w:p>
         </w:tc>
@@ -12483,39 +12395,7 @@
       <w:tr>
         <w:tc>
           <w:tcPr>
-            <w:tcW w:type="dxa" w:w="800"/>
-            <w:tcBorders>
-              <w:top w:val="single" w:color="B7BCC4" w:sz="4"/>
-              <w:left w:val="single" w:color="B7BCC4" w:sz="4"/>
-              <w:bottom w:val="single" w:color="B7BCC4" w:sz="4"/>
-              <w:right w:val="single" w:color="B7BCC4" w:sz="4"/>
-            </w:tcBorders>
-            <w:tcMar>
-              <w:top w:type="dxa" w:w="50"/>
-              <w:left w:type="dxa" w:w="90"/>
-              <w:bottom w:type="dxa" w:w="50"/>
-              <w:right w:type="dxa" w:w="90"/>
-            </w:tcMar>
-            <w:vAlign w:val="center"/>
-          </w:tcPr>
-          <w:p>
-            <w:pPr>
-              <w:jc w:val="center"/>
-            </w:pPr>
-            <w:r>
-              <w:rPr>
-                <w:b w:val="false"/>
-                <w:bCs w:val="false"/>
-                <w:sz w:val="19"/>
-                <w:szCs w:val="19"/>
-              </w:rPr>
-              <w:t xml:space="preserve">3</w:t>
-            </w:r>
-          </w:p>
-        </w:tc>
-        <w:tc>
-          <w:tcPr>
-            <w:tcW w:type="dxa" w:w="4300"/>
+            <w:tcW w:type="dxa" w:w="4200"/>
             <w:tcBorders>
               <w:top w:val="single" w:color="B7BCC4" w:sz="4"/>
               <w:left w:val="single" w:color="B7BCC4" w:sz="4"/>
@@ -12541,13 +12421,13 @@
                 <w:sz w:val="19"/>
                 <w:szCs w:val="19"/>
               </w:rPr>
-              <w:t xml:space="preserve">scripts/run_m2_commands.sh constant | sine | sequence | ik --xyz X Y Z</w:t>
-            </w:r>
-          </w:p>
-        </w:tc>
-        <w:tc>
-          <w:tcPr>
-            <w:tcW w:type="dxa" w:w="3926"/>
+              <w:t xml:space="preserve">scripts/run_ms2.sh constant</w:t>
+            </w:r>
+          </w:p>
+        </w:tc>
+        <w:tc>
+          <w:tcPr>
+            <w:tcW w:type="dxa" w:w="4826"/>
             <w:tcBorders>
               <w:top w:val="single" w:color="B7BCC4" w:sz="4"/>
               <w:left w:val="single" w:color="B7BCC4" w:sz="4"/>
@@ -12573,7 +12453,7 @@
                 <w:sz w:val="19"/>
                 <w:szCs w:val="19"/>
               </w:rPr>
-              <w:t xml:space="preserve">chooses the input that drives the joints</w:t>
+              <w:t xml:space="preserve">hold the home pose (or constant --deg q1 … q6)</w:t>
             </w:r>
           </w:p>
         </w:tc>
@@ -12581,39 +12461,7 @@
       <w:tr>
         <w:tc>
           <w:tcPr>
-            <w:tcW w:type="dxa" w:w="800"/>
-            <w:tcBorders>
-              <w:top w:val="single" w:color="B7BCC4" w:sz="4"/>
-              <w:left w:val="single" w:color="B7BCC4" w:sz="4"/>
-              <w:bottom w:val="single" w:color="B7BCC4" w:sz="4"/>
-              <w:right w:val="single" w:color="B7BCC4" w:sz="4"/>
-            </w:tcBorders>
-            <w:tcMar>
-              <w:top w:type="dxa" w:w="50"/>
-              <w:left w:type="dxa" w:w="90"/>
-              <w:bottom w:type="dxa" w:w="50"/>
-              <w:right w:type="dxa" w:w="90"/>
-            </w:tcMar>
-            <w:vAlign w:val="center"/>
-          </w:tcPr>
-          <w:p>
-            <w:pPr>
-              <w:jc w:val="center"/>
-            </w:pPr>
-            <w:r>
-              <w:rPr>
-                <w:b w:val="false"/>
-                <w:bCs w:val="false"/>
-                <w:sz w:val="19"/>
-                <w:szCs w:val="19"/>
-              </w:rPr>
-              <w:t xml:space="preserve">4</w:t>
-            </w:r>
-          </w:p>
-        </w:tc>
-        <w:tc>
-          <w:tcPr>
-            <w:tcW w:type="dxa" w:w="4300"/>
+            <w:tcW w:type="dxa" w:w="4200"/>
             <w:tcBorders>
               <w:top w:val="single" w:color="B7BCC4" w:sz="4"/>
               <w:left w:val="single" w:color="B7BCC4" w:sz="4"/>
@@ -12639,13 +12487,13 @@
                 <w:sz w:val="19"/>
                 <w:szCs w:val="19"/>
               </w:rPr>
-              <w:t xml:space="preserve">scripts/run_m2_monitor.sh /ur5e/ee_position</w:t>
-            </w:r>
-          </w:p>
-        </w:tc>
-        <w:tc>
-          <w:tcPr>
-            <w:tcW w:type="dxa" w:w="3926"/>
+              <w:t xml:space="preserve">scripts/run_ms2.sh ik --xyz X Y Z</w:t>
+            </w:r>
+          </w:p>
+        </w:tc>
+        <w:tc>
+          <w:tcPr>
+            <w:tcW w:type="dxa" w:w="4826"/>
             <w:tcBorders>
               <w:top w:val="single" w:color="B7BCC4" w:sz="4"/>
               <w:left w:val="single" w:color="B7BCC4" w:sz="4"/>
@@ -12671,7 +12519,73 @@
                 <w:sz w:val="19"/>
                 <w:szCs w:val="19"/>
               </w:rPr>
-              <w:t xml:space="preserve">optional: shows the state coming back from the simulator</w:t>
+              <w:t xml:space="preserve">move the flange to a world point</w:t>
+            </w:r>
+          </w:p>
+        </w:tc>
+      </w:tr>
+      <w:tr>
+        <w:tc>
+          <w:tcPr>
+            <w:tcW w:type="dxa" w:w="4200"/>
+            <w:tcBorders>
+              <w:top w:val="single" w:color="B7BCC4" w:sz="4"/>
+              <w:left w:val="single" w:color="B7BCC4" w:sz="4"/>
+              <w:bottom w:val="single" w:color="B7BCC4" w:sz="4"/>
+              <w:right w:val="single" w:color="B7BCC4" w:sz="4"/>
+            </w:tcBorders>
+            <w:tcMar>
+              <w:top w:type="dxa" w:w="50"/>
+              <w:left w:type="dxa" w:w="90"/>
+              <w:bottom w:type="dxa" w:w="50"/>
+              <w:right w:type="dxa" w:w="90"/>
+            </w:tcMar>
+            <w:vAlign w:val="center"/>
+          </w:tcPr>
+          <w:p>
+            <w:pPr>
+              <w:jc w:val="left"/>
+            </w:pPr>
+            <w:r>
+              <w:rPr>
+                <w:b w:val="false"/>
+                <w:bCs w:val="false"/>
+                <w:sz w:val="19"/>
+                <w:szCs w:val="19"/>
+              </w:rPr>
+              <w:t xml:space="preserve">scripts/run_ms2.sh sliders</w:t>
+            </w:r>
+          </w:p>
+        </w:tc>
+        <w:tc>
+          <w:tcPr>
+            <w:tcW w:type="dxa" w:w="4826"/>
+            <w:tcBorders>
+              <w:top w:val="single" w:color="B7BCC4" w:sz="4"/>
+              <w:left w:val="single" w:color="B7BCC4" w:sz="4"/>
+              <w:bottom w:val="single" w:color="B7BCC4" w:sz="4"/>
+              <w:right w:val="single" w:color="B7BCC4" w:sz="4"/>
+            </w:tcBorders>
+            <w:tcMar>
+              <w:top w:type="dxa" w:w="50"/>
+              <w:left w:type="dxa" w:w="90"/>
+              <w:bottom w:type="dxa" w:w="50"/>
+              <w:right w:type="dxa" w:w="90"/>
+            </w:tcMar>
+            <w:vAlign w:val="center"/>
+          </w:tcPr>
+          <w:p>
+            <w:pPr>
+              <w:jc w:val="left"/>
+            </w:pPr>
+            <w:r>
+              <w:rPr>
+                <w:b w:val="false"/>
+                <w:bCs w:val="false"/>
+                <w:sz w:val="19"/>
+                <w:szCs w:val="19"/>
+              </w:rPr>
+              <w:t xml:space="preserve">no ROS2 input; drag the viewer's Control-panel sliders</w:t>
             </w:r>
           </w:p>
         </w:tc>

</xml_diff>

<commit_message>
Report: correct the wrist joint servo gains
</commit_message>
<xml_diff>
--- a/Milestone 02/report/Milestone_02_Report.docx
+++ b/Milestone 02/report/Milestone_02_Report.docx
@@ -499,7 +499,7 @@
       <w:pPr>
         <w:jc w:val="center"/>
       </w:pPr>
-      <w:hyperlink w:history="1" r:id="rIdinhzwkjdlhufe5lcuihpq">
+      <w:hyperlink w:history="1" r:id="rIdntb8minczgpje4ez2qoxk">
         <w:r>
           <w:rPr>
             <w:rStyle w:val="Hyperlink"/>
@@ -9069,7 +9069,16 @@
         <w:spacing w:after="120" w:line="276"/>
       </w:pPr>
       <w:r>
-        <w:t xml:space="preserve">In that same test the flange reached z = 0.534 m instead of the commanded 0.550 m. This is not a kinematics error, since Section 5.2 shows our FK matches the sensed state exactly. The joint angles themselves are slightly off: the shoulder ended about 1.1° from its command. MuJoCo drives each joint with a simple PD position servo (torque = 2000·(q</w:t>
+        <w:t xml:space="preserve">In that same test the flange reached z = 0.534 m instead of the commanded 0.550 m. This is not a kinematics error, since Section 5.2 shows our FK matches the sensed state exactly. The joint angles themselves are slightly off: the shoulder ended about 1.1° from its command. MuJoCo drives each joint with a simple PD position servo, torque = K</w:t>
+      </w:r>
+      <w:r>
+        <w:rPr>
+          <w:vertAlign w:val="subscript"/>
+        </w:rPr>
+        <w:t xml:space="preserve">p</w:t>
+      </w:r>
+      <w:r>
+        <w:t xml:space="preserve">(q</w:t>
       </w:r>
       <w:r>
         <w:rPr>
@@ -9078,7 +9087,34 @@
         <w:t xml:space="preserve">target</w:t>
       </w:r>
       <w:r>
-        <w:t xml:space="preserve"> − q) − 400·q̇) with no gravity compensation, so the arm settles where the servo torque balances its weight plus the gripper's. Removing this steady-state error is a controller problem, which is what Milestone 4 is about.</w:t>
+        <w:t xml:space="preserve"> − q) − K</w:t>
+      </w:r>
+      <w:r>
+        <w:rPr>
+          <w:vertAlign w:val="subscript"/>
+        </w:rPr>
+        <w:t xml:space="preserve">d</w:t>
+      </w:r>
+      <w:r>
+        <w:t xml:space="preserve">q̇, with K</w:t>
+      </w:r>
+      <w:r>
+        <w:rPr>
+          <w:vertAlign w:val="subscript"/>
+        </w:rPr>
+        <w:t xml:space="preserve">p</w:t>
+      </w:r>
+      <w:r>
+        <w:t xml:space="preserve"> = 2000 and K</w:t>
+      </w:r>
+      <w:r>
+        <w:rPr>
+          <w:vertAlign w:val="subscript"/>
+        </w:rPr>
+        <w:t xml:space="preserve">d</w:t>
+      </w:r>
+      <w:r>
+        <w:t xml:space="preserve"> = 400 for the three big joints (500 and 100 for the wrist joints) and no gravity compensation. So the arm settles where the servo torque balances its weight plus the gripper's. Removing this steady-state error is a controller problem, which is what Milestone 4 is about.</w:t>
       </w:r>
     </w:p>
     <w:p>

</xml_diff>

<commit_message>
Milestone 2: colour sorting application, moving conveyor, colour bins
- Application is now concrete: the UR5e sorts red/green/blue parts from a
  conveyor into matching bins (literature review rewritten with recent sources)
- environment.xml: accumulating conveyor with end stop (fixes rollers that were
  standing upright because euler was read in degrees), colour sensor, three
  bins, six 5 cm parts the 2F-85 can actually grasp
- sim_bridge.py drives the parts on the belt and reports the station colour;
  the ROS2 bridge publishes it on /cell/station_color
- sorting_task.py: IK waypoints + smooth blending for one sorting cycle; the
  publisher's new `sort` mode (default) replaces the step sequence
- Report, README, run script and VS Code tasks updated; figures re-rendered
- Nodes no longer raise on Ctrl+C (rclpy.shutdown called twice)

Co-Authored-By: Claude Opus 5.5 <noreply@anthropic.com>
</commit_message>
<xml_diff>
--- a/Milestone 02/report/Milestone_02_Report.docx
+++ b/Milestone 02/report/Milestone_02_Report.docx
@@ -528,7 +528,7 @@
         <w:spacing w:after="120" w:line="276"/>
       </w:pPr>
       <w:r>
-        <w:t xml:space="preserve">In Milestone 1 we chose a pick-and-place task for a Universal Robots UR5e arm with a Robotiq 2F-85 gripper, and got ROS2 and MuJoCo running. In this milestone we:</w:t>
+        <w:t xml:space="preserve">In Milestone 1 we chose a colour sorting application for a Universal Robots UR5e arm with a Robotiq 2F-85 gripper: parts of different colours arrive on a conveyor, and the robot picks each one up and drops it into the bin of its colour. We also got ROS2 and MuJoCo running. In this milestone we:</w:t>
       </w:r>
     </w:p>
     <w:p>
@@ -593,7 +593,7 @@
         <w:spacing w:after="60"/>
       </w:pPr>
       <w:r>
-        <w:t xml:space="preserve">started building the work cell around the robot: a pedestal, a conveyor with parts on it, and a pallet.</w:t>
+        <w:t xml:space="preserve">built the first version of the colour sorting cell (a moving conveyor, a colour sensor at the pick station and three colour bins) and ran the whole sorting cycle on it using our inverse kinematics.</w:t>
       </w:r>
     </w:p>
     <w:p>
@@ -7286,7 +7286,7 @@
         <w:spacing w:after="120" w:line="276"/>
       </w:pPr>
       <w:r>
-        <w:t xml:space="preserve">The rotation part is diag(1, −1, −1), meaning the gripper points straight down with its x-axis along the world x-axis. That's the natural orientation for picking parts off a conveyor, which is why we use this as the robot's home pose.</w:t>
+        <w:t xml:space="preserve">The rotation part is diag(1, −1, −1), meaning the gripper points straight down with its x-axis along the world x-axis. That's the natural orientation for picking parts off a conveyor, which is why we use this as the robot's home pose. For sorting we turn the gripper a further 90° about the vertical, so that its fingers close across the conveyor belt instead of along it (Section 8).</w:t>
       </w:r>
     </w:p>
     <w:p>
@@ -9019,7 +9019,7 @@
         <w:spacing w:after="60"/>
       </w:pPr>
       <w:r>
-        <w:t xml:space="preserve">sensed joint angles (rad): −1.4625, −0.9719, 1.7544, −2.3212, −1.5708, 0.1083</w:t>
+        <w:t xml:space="preserve">sensed joint angles (rad): −1.4625, −0.9719, 1.7544, −2.3212, −1.5708, −1.4625</w:t>
       </w:r>
     </w:p>
     <w:p>
@@ -9708,7 +9708,7 @@
         <w:spacing w:after="120" w:line="276"/>
       </w:pPr>
       <w:r>
-        <w:t xml:space="preserve">That gives up to 2 × 2 × 2 = 8 solutions. When we use IK to move the robot, we pick the solution closest to the current joint angles and unwrap it, so the arm always turns the short way. For example, it goes −123° instead of +237° when swinging from the conveyor to the pallet.</w:t>
+        <w:t xml:space="preserve">That gives up to 2 × 2 × 2 = 8 solutions. When we use IK to move the robot, we pick the solution closest to the current joint angles and unwrap it, so the arm always turns the short way. For example, when carrying a part from the pick station to the blue bin, joint 1 turns from −113° to −224° (111°) instead of jumping to the wrapped value +136°, which would be a 249° turn the other way.</w:t>
       </w:r>
     </w:p>
     <w:p>
@@ -9879,7 +9879,7 @@
         <w:t xml:space="preserve">sim_bridge.py</w:t>
       </w:r>
       <w:r>
-        <w:t xml:space="preserve"> (macOS) builds the scene (arm + gripper + work cell), opens the MuJoCo viewer, and listens on TCP port 9999. Each incoming command sets the joint motor targets, clipped to the joint limits. 30 times a second it sends back the joint angles, the gripper command and the flange position.</w:t>
+        <w:t xml:space="preserve"> (macOS) builds the scene (arm + gripper + sorting cell), opens the MuJoCo viewer, and listens on TCP port 9999. Each incoming command sets the joint motor targets, clipped to the joint limits. It also runs the conveyor and the colour sensor (Section 9). 30 times a second it sends back the joint angles, the gripper command, the flange position and the colour of the part waiting at the pick station.</w:t>
       </w:r>
     </w:p>
     <w:p>
@@ -9927,7 +9927,7 @@
         <w:spacing w:after="120" w:line="276"/>
       </w:pPr>
       <w:r>
-        <w:t xml:space="preserve">Messages on the socket are one small JSON object per line, for example {"q": [6 joint angles], "gripper": 255}. We tested the link on its own first (three test messages from the container reached the Mac without problems) before building on it.</w:t>
+        <w:t xml:space="preserve">Messages on the socket are one small JSON object per line, for example {"q": [6 joint angles], "gripper": 255} towards the simulator and {"q": [...], "gripper": 0, "ee": [x, y, z], "station": "red"} back from it. We tested the link on its own first (three test messages from the container reached the Mac without problems) before building on it.</w:t>
       </w:r>
     </w:p>
     <w:tbl>
@@ -10477,6 +10477,136 @@
           </w:p>
         </w:tc>
       </w:tr>
+      <w:tr>
+        <w:tc>
+          <w:tcPr>
+            <w:tcW w:type="dxa" w:w="2200"/>
+            <w:tcBorders>
+              <w:top w:val="single" w:color="B7BCC4" w:sz="4"/>
+              <w:left w:val="single" w:color="B7BCC4" w:sz="4"/>
+              <w:bottom w:val="single" w:color="B7BCC4" w:sz="4"/>
+              <w:right w:val="single" w:color="B7BCC4" w:sz="4"/>
+            </w:tcBorders>
+            <w:tcMar>
+              <w:top w:type="dxa" w:w="50"/>
+              <w:left w:type="dxa" w:w="90"/>
+              <w:bottom w:type="dxa" w:w="50"/>
+              <w:right w:type="dxa" w:w="90"/>
+            </w:tcMar>
+            <w:vAlign w:val="center"/>
+          </w:tcPr>
+          <w:p>
+            <w:pPr>
+              <w:jc w:val="left"/>
+            </w:pPr>
+            <w:r>
+              <w:rPr>
+                <w:b w:val="false"/>
+                <w:bCs w:val="false"/>
+                <w:sz w:val="19"/>
+                <w:szCs w:val="19"/>
+              </w:rPr>
+              <w:t xml:space="preserve">/cell/station_color</w:t>
+            </w:r>
+          </w:p>
+        </w:tc>
+        <w:tc>
+          <w:tcPr>
+            <w:tcW w:type="dxa" w:w="2350"/>
+            <w:tcBorders>
+              <w:top w:val="single" w:color="B7BCC4" w:sz="4"/>
+              <w:left w:val="single" w:color="B7BCC4" w:sz="4"/>
+              <w:bottom w:val="single" w:color="B7BCC4" w:sz="4"/>
+              <w:right w:val="single" w:color="B7BCC4" w:sz="4"/>
+            </w:tcBorders>
+            <w:tcMar>
+              <w:top w:type="dxa" w:w="50"/>
+              <w:left w:type="dxa" w:w="90"/>
+              <w:bottom w:type="dxa" w:w="50"/>
+              <w:right w:type="dxa" w:w="90"/>
+            </w:tcMar>
+            <w:vAlign w:val="center"/>
+          </w:tcPr>
+          <w:p>
+            <w:pPr>
+              <w:jc w:val="left"/>
+            </w:pPr>
+            <w:r>
+              <w:rPr>
+                <w:b w:val="false"/>
+                <w:bCs w:val="false"/>
+                <w:sz w:val="19"/>
+                <w:szCs w:val="19"/>
+              </w:rPr>
+              <w:t xml:space="preserve">std_msgs/String</w:t>
+            </w:r>
+          </w:p>
+        </w:tc>
+        <w:tc>
+          <w:tcPr>
+            <w:tcW w:type="dxa" w:w="1500"/>
+            <w:tcBorders>
+              <w:top w:val="single" w:color="B7BCC4" w:sz="4"/>
+              <w:left w:val="single" w:color="B7BCC4" w:sz="4"/>
+              <w:bottom w:val="single" w:color="B7BCC4" w:sz="4"/>
+              <w:right w:val="single" w:color="B7BCC4" w:sz="4"/>
+            </w:tcBorders>
+            <w:tcMar>
+              <w:top w:type="dxa" w:w="50"/>
+              <w:left w:type="dxa" w:w="90"/>
+              <w:bottom w:type="dxa" w:w="50"/>
+              <w:right w:type="dxa" w:w="90"/>
+            </w:tcMar>
+            <w:vAlign w:val="center"/>
+          </w:tcPr>
+          <w:p>
+            <w:pPr>
+              <w:jc w:val="left"/>
+            </w:pPr>
+            <w:r>
+              <w:rPr>
+                <w:b w:val="false"/>
+                <w:bCs w:val="false"/>
+                <w:sz w:val="19"/>
+                <w:szCs w:val="19"/>
+              </w:rPr>
+              <w:t xml:space="preserve">MuJoCo → ROS2</w:t>
+            </w:r>
+          </w:p>
+        </w:tc>
+        <w:tc>
+          <w:tcPr>
+            <w:tcW w:type="dxa" w:w="2976"/>
+            <w:tcBorders>
+              <w:top w:val="single" w:color="B7BCC4" w:sz="4"/>
+              <w:left w:val="single" w:color="B7BCC4" w:sz="4"/>
+              <w:bottom w:val="single" w:color="B7BCC4" w:sz="4"/>
+              <w:right w:val="single" w:color="B7BCC4" w:sz="4"/>
+            </w:tcBorders>
+            <w:tcMar>
+              <w:top w:type="dxa" w:w="50"/>
+              <w:left w:type="dxa" w:w="90"/>
+              <w:bottom w:type="dxa" w:w="50"/>
+              <w:right w:type="dxa" w:w="90"/>
+            </w:tcMar>
+            <w:vAlign w:val="center"/>
+          </w:tcPr>
+          <w:p>
+            <w:pPr>
+              <w:jc w:val="left"/>
+            </w:pPr>
+            <w:r>
+              <w:rPr>
+                <w:b w:val="false"/>
+                <w:bCs w:val="false"/>
+                <w:sz w:val="19"/>
+                <w:szCs w:val="19"/>
+              </w:rPr>
+              <w:t xml:space="preserve">colour of the part waiting at the pick station: "red", "green", "blue", or "" when empty</w:t>
+            </w:r>
+          </w:p>
+        </w:tc>
+      </w:tr>
     </w:tbl>
     <w:p>
       <w:pPr>
@@ -10582,10 +10712,10 @@
           <w:b/>
           <w:bCs/>
         </w:rPr>
-        <w:t xml:space="preserve">Signal builder 2, pick-and-place sequence:</w:t>
-      </w:r>
-      <w:r>
-        <w:t xml:space="preserve"> a piecewise-constant (step) signal that walks through the waypoints of our application, holding each for 2.5 s (Table 6). The waypoints are defined in world coordinates and turned into joint angles with our IK, so this also exercises the inverse kinematics.</w:t>
+        <w:t xml:space="preserve">Signal builder 2, colour sorting sequence:</w:t>
+      </w:r>
+      <w:r>
+        <w:t xml:space="preserve"> a waypoint signal that runs our application (Table 6). It waits until the colour sensor reports a part at the pick station, then walks through eight waypoints that carry that part to the bin of its colour. Each waypoint is defined in world coordinates and turned into joint angles with our IK, and the command blends smoothly to it over 0.8 to 2.5 s (a cosine blend, so the arm starts and stops gently), which makes one cycle take 12.8 s. When the cycle ends the robot waits for the next part.</w:t>
       </w:r>
     </w:p>
     <w:p>
@@ -10846,7 +10976,7 @@
                 <w:sz w:val="19"/>
                 <w:szCs w:val="19"/>
               </w:rPr>
-              <w:t xml:space="preserve">home</w:t>
+              <w:t xml:space="preserve">above station</w:t>
             </w:r>
           </w:p>
         </w:tc>
@@ -10878,7 +11008,7 @@
                 <w:sz w:val="19"/>
                 <w:szCs w:val="19"/>
               </w:rPr>
-              <w:t xml:space="preserve">home pose</w:t>
+              <w:t xml:space="preserve">(0.105, 0.60, 0.70)</w:t>
             </w:r>
           </w:p>
         </w:tc>
@@ -10976,7 +11106,7 @@
                 <w:sz w:val="19"/>
                 <w:szCs w:val="19"/>
               </w:rPr>
-              <w:t xml:space="preserve">above conveyor</w:t>
+              <w:t xml:space="preserve">down to part</w:t>
             </w:r>
           </w:p>
         </w:tc>
@@ -11008,7 +11138,7 @@
                 <w:sz w:val="19"/>
                 <w:szCs w:val="19"/>
               </w:rPr>
-              <w:t xml:space="preserve">(−0.20, 0.60, 0.70)</w:t>
+              <w:t xml:space="preserve">(0.105, 0.60, 0.486)</w:t>
             </w:r>
           </w:p>
         </w:tc>
@@ -11106,7 +11236,7 @@
                 <w:sz w:val="19"/>
                 <w:szCs w:val="19"/>
               </w:rPr>
-              <w:t xml:space="preserve">down to conveyor</w:t>
+              <w:t xml:space="preserve">close gripper</w:t>
             </w:r>
           </w:p>
         </w:tc>
@@ -11138,7 +11268,7 @@
                 <w:sz w:val="19"/>
                 <w:szCs w:val="19"/>
               </w:rPr>
-              <w:t xml:space="preserve">(−0.20, 0.60, 0.55)</w:t>
+              <w:t xml:space="preserve">(0.105, 0.60, 0.486)</w:t>
             </w:r>
           </w:p>
         </w:tc>
@@ -11170,7 +11300,7 @@
                 <w:sz w:val="19"/>
                 <w:szCs w:val="19"/>
               </w:rPr>
-              <w:t xml:space="preserve">open</w:t>
+              <w:t xml:space="preserve">closed</w:t>
             </w:r>
           </w:p>
         </w:tc>
@@ -11236,7 +11366,7 @@
                 <w:sz w:val="19"/>
                 <w:szCs w:val="19"/>
               </w:rPr>
-              <w:t xml:space="preserve">close gripper</w:t>
+              <w:t xml:space="preserve">lift</w:t>
             </w:r>
           </w:p>
         </w:tc>
@@ -11268,7 +11398,7 @@
                 <w:sz w:val="19"/>
                 <w:szCs w:val="19"/>
               </w:rPr>
-              <w:t xml:space="preserve">(−0.20, 0.60, 0.55)</w:t>
+              <w:t xml:space="preserve">(0.105, 0.60, 0.70)</w:t>
             </w:r>
           </w:p>
         </w:tc>
@@ -11366,7 +11496,7 @@
                 <w:sz w:val="19"/>
                 <w:szCs w:val="19"/>
               </w:rPr>
-              <w:t xml:space="preserve">lift</w:t>
+              <w:t xml:space="preserve">above the bin of the part's colour</w:t>
             </w:r>
           </w:p>
         </w:tc>
@@ -11398,7 +11528,7 @@
                 <w:sz w:val="19"/>
                 <w:szCs w:val="19"/>
               </w:rPr>
-              <w:t xml:space="preserve">(−0.20, 0.60, 0.70)</w:t>
+              <w:t xml:space="preserve">red (0.55, 0.25, 0.70), green (0.55, −0.05, 0.70), blue (0.55, −0.35, 0.70)</w:t>
             </w:r>
           </w:p>
         </w:tc>
@@ -11496,7 +11626,7 @@
                 <w:sz w:val="19"/>
                 <w:szCs w:val="19"/>
               </w:rPr>
-              <w:t xml:space="preserve">above pallet</w:t>
+              <w:t xml:space="preserve">down into the bin</w:t>
             </w:r>
           </w:p>
         </w:tc>
@@ -11528,7 +11658,7 @@
                 <w:sz w:val="19"/>
                 <w:szCs w:val="19"/>
               </w:rPr>
-              <w:t xml:space="preserve">(0.60, −0.15, 0.60)</w:t>
+              <w:t xml:space="preserve">same x, y as step 5, z = 0.52</w:t>
             </w:r>
           </w:p>
         </w:tc>
@@ -11626,7 +11756,7 @@
                 <w:sz w:val="19"/>
                 <w:szCs w:val="19"/>
               </w:rPr>
-              <w:t xml:space="preserve">down to pallet</w:t>
+              <w:t xml:space="preserve">open gripper (part drops in)</w:t>
             </w:r>
           </w:p>
         </w:tc>
@@ -11658,7 +11788,7 @@
                 <w:sz w:val="19"/>
                 <w:szCs w:val="19"/>
               </w:rPr>
-              <w:t xml:space="preserve">(0.60, −0.15, 0.40)</w:t>
+              <w:t xml:space="preserve">same as step 6</w:t>
             </w:r>
           </w:p>
         </w:tc>
@@ -11690,7 +11820,7 @@
                 <w:sz w:val="19"/>
                 <w:szCs w:val="19"/>
               </w:rPr>
-              <w:t xml:space="preserve">closed</w:t>
+              <w:t xml:space="preserve">open</w:t>
             </w:r>
           </w:p>
         </w:tc>
@@ -11756,7 +11886,7 @@
                 <w:sz w:val="19"/>
                 <w:szCs w:val="19"/>
               </w:rPr>
-              <w:t xml:space="preserve">open gripper</w:t>
+              <w:t xml:space="preserve">back above station</w:t>
             </w:r>
           </w:p>
         </w:tc>
@@ -11788,137 +11918,7 @@
                 <w:sz w:val="19"/>
                 <w:szCs w:val="19"/>
               </w:rPr>
-              <w:t xml:space="preserve">(0.60, −0.15, 0.40)</w:t>
-            </w:r>
-          </w:p>
-        </w:tc>
-        <w:tc>
-          <w:tcPr>
-            <w:tcW w:type="dxa" w:w="2200"/>
-            <w:tcBorders>
-              <w:top w:val="single" w:color="B7BCC4" w:sz="4"/>
-              <w:left w:val="single" w:color="B7BCC4" w:sz="4"/>
-              <w:bottom w:val="single" w:color="B7BCC4" w:sz="4"/>
-              <w:right w:val="single" w:color="B7BCC4" w:sz="4"/>
-            </w:tcBorders>
-            <w:tcMar>
-              <w:top w:type="dxa" w:w="50"/>
-              <w:left w:type="dxa" w:w="90"/>
-              <w:bottom w:type="dxa" w:w="50"/>
-              <w:right w:type="dxa" w:w="90"/>
-            </w:tcMar>
-            <w:vAlign w:val="center"/>
-          </w:tcPr>
-          <w:p>
-            <w:pPr>
-              <w:jc w:val="center"/>
-            </w:pPr>
-            <w:r>
-              <w:rPr>
-                <w:b w:val="false"/>
-                <w:bCs w:val="false"/>
-                <w:sz w:val="19"/>
-                <w:szCs w:val="19"/>
-              </w:rPr>
-              <w:t xml:space="preserve">open</w:t>
-            </w:r>
-          </w:p>
-        </w:tc>
-      </w:tr>
-      <w:tr>
-        <w:tc>
-          <w:tcPr>
-            <w:tcW w:type="dxa" w:w="900"/>
-            <w:tcBorders>
-              <w:top w:val="single" w:color="B7BCC4" w:sz="4"/>
-              <w:left w:val="single" w:color="B7BCC4" w:sz="4"/>
-              <w:bottom w:val="single" w:color="B7BCC4" w:sz="4"/>
-              <w:right w:val="single" w:color="B7BCC4" w:sz="4"/>
-            </w:tcBorders>
-            <w:tcMar>
-              <w:top w:type="dxa" w:w="50"/>
-              <w:left w:type="dxa" w:w="90"/>
-              <w:bottom w:type="dxa" w:w="50"/>
-              <w:right w:type="dxa" w:w="90"/>
-            </w:tcMar>
-            <w:vAlign w:val="center"/>
-          </w:tcPr>
-          <w:p>
-            <w:pPr>
-              <w:jc w:val="center"/>
-            </w:pPr>
-            <w:r>
-              <w:rPr>
-                <w:b w:val="false"/>
-                <w:bCs w:val="false"/>
-                <w:sz w:val="19"/>
-                <w:szCs w:val="19"/>
-              </w:rPr>
-              <w:t xml:space="preserve">9</w:t>
-            </w:r>
-          </w:p>
-        </w:tc>
-        <w:tc>
-          <w:tcPr>
-            <w:tcW w:type="dxa" w:w="2400"/>
-            <w:tcBorders>
-              <w:top w:val="single" w:color="B7BCC4" w:sz="4"/>
-              <w:left w:val="single" w:color="B7BCC4" w:sz="4"/>
-              <w:bottom w:val="single" w:color="B7BCC4" w:sz="4"/>
-              <w:right w:val="single" w:color="B7BCC4" w:sz="4"/>
-            </w:tcBorders>
-            <w:tcMar>
-              <w:top w:type="dxa" w:w="50"/>
-              <w:left w:type="dxa" w:w="90"/>
-              <w:bottom w:type="dxa" w:w="50"/>
-              <w:right w:type="dxa" w:w="90"/>
-            </w:tcMar>
-            <w:vAlign w:val="center"/>
-          </w:tcPr>
-          <w:p>
-            <w:pPr>
-              <w:jc w:val="left"/>
-            </w:pPr>
-            <w:r>
-              <w:rPr>
-                <w:b w:val="false"/>
-                <w:bCs w:val="false"/>
-                <w:sz w:val="19"/>
-                <w:szCs w:val="19"/>
-              </w:rPr>
-              <w:t xml:space="preserve">retreat</w:t>
-            </w:r>
-          </w:p>
-        </w:tc>
-        <w:tc>
-          <w:tcPr>
-            <w:tcW w:type="dxa" w:w="3526"/>
-            <w:tcBorders>
-              <w:top w:val="single" w:color="B7BCC4" w:sz="4"/>
-              <w:left w:val="single" w:color="B7BCC4" w:sz="4"/>
-              <w:bottom w:val="single" w:color="B7BCC4" w:sz="4"/>
-              <w:right w:val="single" w:color="B7BCC4" w:sz="4"/>
-            </w:tcBorders>
-            <w:tcMar>
-              <w:top w:type="dxa" w:w="50"/>
-              <w:left w:type="dxa" w:w="90"/>
-              <w:bottom w:type="dxa" w:w="50"/>
-              <w:right w:type="dxa" w:w="90"/>
-            </w:tcMar>
-            <w:vAlign w:val="center"/>
-          </w:tcPr>
-          <w:p>
-            <w:pPr>
-              <w:jc w:val="center"/>
-            </w:pPr>
-            <w:r>
-              <w:rPr>
-                <w:b w:val="false"/>
-                <w:bCs w:val="false"/>
-                <w:sz w:val="19"/>
-                <w:szCs w:val="19"/>
-              </w:rPr>
-              <w:t xml:space="preserve">(0.60, −0.15, 0.60)</w:t>
+              <w:t xml:space="preserve">(0.105, 0.60, 0.70)</w:t>
             </w:r>
           </w:p>
         </w:tc>
@@ -11969,7 +11969,7 @@
           <w:sz w:val="19"/>
           <w:szCs w:val="19"/>
         </w:rPr>
-        <w:t xml:space="preserve">Table 6: The pick-and-place step sequence. It shows the motion of the task; actually grasping the parts comes in later milestones.</w:t>
+        <w:t xml:space="preserve">Table 6: One sorting cycle. The grasp height puts the gripper pads just above the centre of the 5 cm part, and the drop height releases the part a few centimetres above the bin's rim.</w:t>
       </w:r>
     </w:p>
     <w:p>
@@ -11987,7 +11987,7 @@
         <w:t xml:space="preserve">/ur5e/joint_states</w:t>
       </w:r>
       <w:r>
-        <w:t xml:space="preserve"> and </w:t>
+        <w:t xml:space="preserve">, </w:t>
       </w:r>
       <w:r>
         <w:rPr>
@@ -11997,7 +11997,7 @@
         <w:t xml:space="preserve">/ur5e/ee_position</w:t>
       </w:r>
       <w:r>
-        <w:t xml:space="preserve"> can be watched live with </w:t>
+        <w:t xml:space="preserve"> and /cell/station_color can be watched live with </w:t>
       </w:r>
       <w:r>
         <w:rPr>
@@ -12015,7 +12015,7 @@
         <w:pStyle w:val="Heading1"/>
       </w:pPr>
       <w:r>
-        <w:t xml:space="preserve">9. The work cell (first version of the GUI)</w:t>
+        <w:t xml:space="preserve">9. The colour sorting cell (first version of the GUI)</w:t>
       </w:r>
     </w:p>
     <w:p>
@@ -12023,7 +12023,7 @@
         <w:spacing w:after="120" w:line="276"/>
       </w:pPr>
       <w:r>
-        <w:t xml:space="preserve">We started building the environment around the robot in its own file, </w:t>
+        <w:t xml:space="preserve">We built the environment around the robot in its own file, </w:t>
       </w:r>
       <w:r>
         <w:rPr>
@@ -12043,7 +12043,7 @@
         <w:t xml:space="preserve">sim_bridge.py</w:t>
       </w:r>
       <w:r>
-        <w:t xml:space="preserve"> attaches to the robot scene when it starts (Figure 4):</w:t>
+        <w:t xml:space="preserve"> attaches to the robot scene when it starts (Figures 4 and 5):</w:t>
       </w:r>
     </w:p>
     <w:p>
@@ -12069,7 +12069,7 @@
         <w:spacing w:after="60"/>
       </w:pPr>
       <w:r>
-        <w:t xml:space="preserve">a 1.8 m conveyor in front of the robot (belt surface at 0.30 m, with rollers, side rails and legs),</w:t>
+        <w:t xml:space="preserve">a 1.2 m accumulating conveyor in front of the robot (belt surface at 0.30 m, with rollers, side rails and legs). The belt carries the parts at 8 cm/s towards a yellow end stop. Parts that reach the end stop, or the part in front of them, stop and queue up, like on a real accumulating conveyor. The belt geom itself does not move; every simulation step, sim_bridge.py gives the belt's speed to each part resting on it,</w:t>
       </w:r>
     </w:p>
     <w:p>
@@ -12082,7 +12082,7 @@
         <w:spacing w:after="60"/>
       </w:pPr>
       <w:r>
-        <w:t xml:space="preserve">three 8 cm parts (red, blue and green, 0.2 kg each) lying on the belt. They are free bodies, so they fall and collide realistically,</w:t>
+        <w:t xml:space="preserve">a pick station at the end stop, where the front part waits for the robot,</w:t>
       </w:r>
     </w:p>
     <w:p>
@@ -12095,7 +12095,33 @@
         <w:spacing w:after="60"/>
       </w:pPr>
       <w:r>
-        <w:t xml:space="preserve">a wooden pallet to the robot's side, where parts will be placed,</w:t>
+        <w:t xml:space="preserve">a colour sensor on a post beside the pick station. It reports the colour of the part waiting there, which reaches ROS2 as /cell/station_color,</w:t>
+      </w:r>
+    </w:p>
+    <w:p>
+      <w:pPr>
+        <w:pStyle w:val="ListParagraph"/>
+        <w:numPr>
+          <w:ilvl w:val="0"/>
+          <w:numId w:val="2"/>
+        </w:numPr>
+        <w:spacing w:after="60"/>
+      </w:pPr>
+      <w:r>
+        <w:t xml:space="preserve">three open bins beside the robot, coloured red, green and blue,</w:t>
+      </w:r>
+    </w:p>
+    <w:p>
+      <w:pPr>
+        <w:pStyle w:val="ListParagraph"/>
+        <w:numPr>
+          <w:ilvl w:val="0"/>
+          <w:numId w:val="2"/>
+        </w:numPr>
+        <w:spacing w:after="60"/>
+      </w:pPr>
+      <w:r>
+        <w:t xml:space="preserve">six 5 cm parts (two of each colour, 0.1 kg each) on the belt in mixed order. They are free bodies, so they collide, are grasped by the gripper's fingers and fall into the bins under real physics,</w:t>
       </w:r>
     </w:p>
     <w:p>
@@ -12170,7 +12196,69 @@
           <w:sz w:val="19"/>
           <w:szCs w:val="19"/>
         </w:rPr>
-        <w:t xml:space="preserve">Figure 4: The work cell in MuJoCo, with the UR5e and gripper in the home pose.</w:t>
+        <w:t xml:space="preserve">Figure 4: The colour sorting cell in MuJoCo. The first part has reached the pick station and the others are on their way.</w:t>
+      </w:r>
+    </w:p>
+    <w:p>
+      <w:pPr>
+        <w:spacing w:after="60" w:before="120"/>
+        <w:jc w:val="center"/>
+      </w:pPr>
+      <w:r>
+        <w:drawing>
+          <wp:inline distT="0" distB="0" distL="0" distR="0">
+            <wp:extent cx="5334000" cy="3333750"/>
+            <wp:effectExtent t="0" r="0" b="0" l="0"/>
+            <wp:docPr id="2" name="Figure 5" descr="" title=""/>
+            <wp:cNvGraphicFramePr>
+              <a:graphicFrameLocks xmlns:a="http://schemas.openxmlformats.org/drawingml/2006/main" noChangeAspect="1"/>
+            </wp:cNvGraphicFramePr>
+            <a:graphic xmlns:a="http://schemas.openxmlformats.org/drawingml/2006/main">
+              <a:graphicData uri="http://schemas.openxmlformats.org/drawingml/2006/picture">
+                <pic:pic xmlns:pic="http://schemas.openxmlformats.org/drawingml/2006/picture">
+                  <pic:nvPicPr>
+                    <pic:cNvPr id="0" name="sorting_in_action.png" descr=""/>
+                    <pic:cNvPicPr>
+                      <a:picLocks noChangeAspect="1" noChangeArrowheads="1"/>
+                    </pic:cNvPicPr>
+                  </pic:nvPicPr>
+                  <pic:blipFill>
+                    <a:blip r:embed="rIdSort1" cstate="none"/>
+                    <a:srcRect/>
+                    <a:stretch>
+                      <a:fillRect/>
+                    </a:stretch>
+                  </pic:blipFill>
+                  <pic:spPr bwMode="auto">
+                    <a:xfrm>
+                      <a:off x="0" y="0"/>
+                      <a:ext cx="5334000" cy="3333750"/>
+                    </a:xfrm>
+                    <a:prstGeom prst="rect">
+                      <a:avLst/>
+                    </a:prstGeom>
+                  </pic:spPr>
+                </pic:pic>
+              </a:graphicData>
+            </a:graphic>
+          </wp:inline>
+        </w:drawing>
+      </w:r>
+    </w:p>
+    <w:p>
+      <w:pPr>
+        <w:spacing w:after="240" w:before="60"/>
+        <w:jc w:val="center"/>
+      </w:pPr>
+      <w:r>
+        <w:rPr>
+          <w:i/>
+          <w:iCs/>
+          <w:color w:val="444444"/>
+          <w:sz w:val="19"/>
+          <w:szCs w:val="19"/>
+        </w:rPr>
+        <w:t xml:space="preserve">Figure 5: Halfway through the first cycle: the robot carries the red part to the red bin, while the next parts queue at the end stop.</w:t>
       </w:r>
     </w:p>
     <w:p>
@@ -12178,7 +12266,7 @@
         <w:spacing w:after="120" w:line="276"/>
       </w:pPr>
       <w:r>
-        <w:t xml:space="preserve">For Milestone 3 we plan to make the conveyor actually move parts, add more parts and details (a worker, a control cabinet), and grow this into the full environment.</w:t>
+        <w:t xml:space="preserve">We tested the whole cell end to end, with sim_bridge.py, the ROS2 bridge node and the sorting sequence running together: all six parts were picked from the station and dropped into the bin of their own colour, in about 83 s. For Milestone 3 we plan to add more parts, a reject bin for defective parts and more details of the cell (a worker, a control cabinet), and grow this into the full environment.</w:t>
       </w:r>
     </w:p>
     <w:p>
@@ -12357,7 +12445,7 @@
                 <w:sz w:val="19"/>
                 <w:szCs w:val="19"/>
               </w:rPr>
-              <w:t xml:space="preserve">pick-and-place step sequence (default)</w:t>
+              <w:t xml:space="preserve">colour sorting (default)</w:t>
             </w:r>
           </w:p>
         </w:tc>
@@ -12665,7 +12753,7 @@
         <w:t xml:space="preserve">Milestone 02/code</w:t>
       </w:r>
       <w:r>
-        <w:t xml:space="preserve">) re-runs every check in Sections 5 and 6 and redraws Figure 2.</w:t>
+        <w:t xml:space="preserve">) re-runs every check in Sections 5 and 6 and redraws Figure 2, and python3 render_scene.py redraws Figures 1, 4 and 5.</w:t>
       </w:r>
     </w:p>
     <w:p>
@@ -12681,7 +12769,7 @@
         <w:spacing w:after="120" w:line="276"/>
       </w:pPr>
       <w:r>
-        <w:t xml:space="preserve">We assigned DH frames to the UR5e, built its DH table from the simulated model, and derived its forward kinematics, both as a matrix product and as closed-form position equations. The forward kinematics matches MuJoCo exactly, both offline and live through ROS2. We also have a closed-form inverse kinematics that recovered the original angles in all 2000 random tests. ROS2 and MuJoCo now work as one system: ROS2 commands move the simulated robot and its state flows back into ROS2. The joints can be driven with constants, two kinds of signal builders, sliders and IK targets, and the first version of the pick-and-place work cell is in place.</w:t>
+        <w:t xml:space="preserve">We assigned DH frames to the UR5e, built its DH table from the simulated model, and derived its forward kinematics, both as a matrix product and as closed-form position equations. The forward kinematics matches MuJoCo exactly, both offline and live through ROS2. We also have a closed-form inverse kinematics that recovered the original angles in all 2000 random tests. ROS2 and MuJoCo now work as one system: ROS2 commands move the simulated robot and its state flows back into ROS2. The joints can be driven with constants, two kinds of signal builders, sliders and IK targets, and the first version of our colour sorting cell works: a moving conveyor feeds parts to a pick station, a colour sensor reports each part's colour through ROS2, and the robot sorts every part into the bin of its colour.</w:t>
       </w:r>
     </w:p>
     <w:p>

</xml_diff>